<commit_message>
DSOA-6 Update technology comparison
</commit_message>
<xml_diff>
--- a/docs/research/Compare and Justify Project Technologies.docx
+++ b/docs/research/Compare and Justify Project Technologies.docx
@@ -3871,6 +3871,40 @@
     </w:p>
     <w:p>
       <w:pPr>
+        <w:spacing w:before="100" w:beforeAutospacing="1" w:after="100" w:afterAutospacing="1" w:line="240" w:lineRule="auto"/>
+        <w:rPr>
+          <w:rFonts w:ascii="Times New Roman" w:eastAsia="Times New Roman" w:hAnsi="Times New Roman" w:cs="Times New Roman"/>
+          <w:sz w:val="24"/>
+          <w:szCs w:val="24"/>
+          <w:lang w:val="en-US" w:eastAsia="ru-RU"/>
+        </w:rPr>
+      </w:pPr>
+      <w:r>
+        <w:rPr>
+          <w:rFonts w:ascii="Times New Roman" w:eastAsia="Times New Roman" w:hAnsi="Times New Roman" w:cs="Times New Roman"/>
+          <w:sz w:val="24"/>
+          <w:szCs w:val="24"/>
+          <w:lang w:val="en-US" w:eastAsia="ru-RU"/>
+        </w:rPr>
+        <w:t>The team also considered React with Firebase as an alternative based on the supervisor's feedback. A comparison of both technology stacks is presented in the following section.</w:t>
+      </w:r>
+    </w:p>
+    <w:p>
+      <w:pPr>
+        <w:pStyle w:val="2"/>
+        <w:rPr>
+          <w:lang w:val="en-US"/>
+        </w:rPr>
+      </w:pPr>
+      <w:r>
+        <w:rPr>
+          <w:lang w:val="en-US"/>
+        </w:rPr>
+        <w:t>6. Alternative Technology Stack: React + Firebase</w:t>
+      </w:r>
+    </w:p>
+    <w:p>
+      <w:pPr>
         <w:pStyle w:val="a3"/>
         <w:rPr>
           <w:lang w:val="en-US"/>
@@ -3880,10 +3914,1103 @@
         <w:rPr>
           <w:lang w:val="en-US"/>
         </w:rPr>
-        <w:t>The final decision will be based on the project's requirements and the team's technical experience.</w:t>
+        <w:t>Based on the supervisor's feedback, React with Firebase was considered as an alternative technology stack for the project.</w:t>
+      </w:r>
+    </w:p>
+    <w:p>
+      <w:pPr>
+        <w:pStyle w:val="a3"/>
+        <w:rPr>
+          <w:lang w:val="en-US"/>
+        </w:rPr>
+      </w:pPr>
+      <w:r>
+        <w:rPr>
+          <w:lang w:val="en-US"/>
+        </w:rPr>
+        <w:t>React is a JavaScript library for building user interfaces. Firebase provides services such as authentication, cloud database storage, hosting, and serverless functions.</w:t>
+      </w:r>
+    </w:p>
+    <w:p>
+      <w:pPr>
+        <w:pStyle w:val="a3"/>
+        <w:rPr>
+          <w:lang w:val="en-US"/>
+        </w:rPr>
+      </w:pPr>
+      <w:r>
+        <w:rPr>
+          <w:lang w:val="en-US"/>
+        </w:rPr>
+        <w:t>This combination could simplify the development process and reduce the need to manage a separate backend server.</w:t>
+      </w:r>
+    </w:p>
+    <w:p>
+      <w:pPr>
+        <w:pStyle w:val="3"/>
+        <w:rPr>
+          <w:rFonts w:ascii="Times New Roman" w:hAnsi="Times New Roman" w:cs="Times New Roman"/>
+          <w:b/>
+          <w:bCs/>
+          <w:color w:val="auto"/>
+          <w:lang w:val="en-US"/>
+        </w:rPr>
+      </w:pPr>
+      <w:r>
+        <w:rPr>
+          <w:rFonts w:ascii="Times New Roman" w:hAnsi="Times New Roman" w:cs="Times New Roman"/>
+          <w:b/>
+          <w:bCs/>
+          <w:color w:val="auto"/>
+          <w:lang w:val="en-US"/>
+        </w:rPr>
+        <w:t>6.1. Comparison of Technology Stacks</w:t>
+      </w:r>
+    </w:p>
+    <w:p>
+      <w:pPr>
+        <w:pStyle w:val="a3"/>
+        <w:rPr>
+          <w:lang w:val="en-US"/>
+        </w:rPr>
+      </w:pPr>
+      <w:r>
+        <w:rPr>
+          <w:rStyle w:val="a4"/>
+          <w:rFonts w:eastAsiaTheme="majorEastAsia"/>
+          <w:lang w:val="en-US"/>
+        </w:rPr>
+        <w:t>Table 5. Comparison of the Selected and Alternative Technology Stacks</w:t>
+      </w:r>
+    </w:p>
+    <w:tbl>
+      <w:tblPr>
+        <w:tblW w:w="0" w:type="auto"/>
+        <w:tblCellSpacing w:w="15" w:type="dxa"/>
+        <w:tblBorders>
+          <w:insideH w:val="single" w:sz="4" w:space="0" w:color="auto"/>
+        </w:tblBorders>
+        <w:tblCellMar>
+          <w:top w:w="15" w:type="dxa"/>
+          <w:left w:w="15" w:type="dxa"/>
+          <w:bottom w:w="15" w:type="dxa"/>
+          <w:right w:w="15" w:type="dxa"/>
+        </w:tblCellMar>
+        <w:tblLook w:val="04A0" w:firstRow="1" w:lastRow="0" w:firstColumn="1" w:lastColumn="0" w:noHBand="0" w:noVBand="1"/>
+      </w:tblPr>
+      <w:tblGrid>
+        <w:gridCol w:w="1937"/>
+        <w:gridCol w:w="3529"/>
+        <w:gridCol w:w="3889"/>
+      </w:tblGrid>
+      <w:tr>
+        <w:trPr>
+          <w:tblCellSpacing w:w="15" w:type="dxa"/>
+        </w:trPr>
+        <w:tc>
+          <w:tcPr>
+            <w:tcW w:w="0" w:type="auto"/>
+            <w:vAlign w:val="center"/>
+            <w:hideMark/>
+          </w:tcPr>
+          <w:p>
+            <w:pPr>
+              <w:jc w:val="center"/>
+              <w:rPr>
+                <w:rFonts w:ascii="Times New Roman" w:hAnsi="Times New Roman" w:cs="Times New Roman"/>
+                <w:b/>
+                <w:bCs/>
+              </w:rPr>
+            </w:pPr>
+            <w:proofErr w:type="spellStart"/>
+            <w:r>
+              <w:rPr>
+                <w:rFonts w:ascii="Times New Roman" w:hAnsi="Times New Roman" w:cs="Times New Roman"/>
+                <w:b/>
+                <w:bCs/>
+              </w:rPr>
+              <w:t>Criteria</w:t>
+            </w:r>
+            <w:proofErr w:type="spellEnd"/>
+          </w:p>
+        </w:tc>
+        <w:tc>
+          <w:tcPr>
+            <w:tcW w:w="0" w:type="auto"/>
+            <w:vAlign w:val="center"/>
+            <w:hideMark/>
+          </w:tcPr>
+          <w:p>
+            <w:pPr>
+              <w:jc w:val="center"/>
+              <w:rPr>
+                <w:rFonts w:ascii="Times New Roman" w:hAnsi="Times New Roman" w:cs="Times New Roman"/>
+                <w:b/>
+                <w:bCs/>
+                <w:lang w:val="en-US"/>
+              </w:rPr>
+            </w:pPr>
+            <w:r>
+              <w:rPr>
+                <w:rFonts w:ascii="Times New Roman" w:hAnsi="Times New Roman" w:cs="Times New Roman"/>
+                <w:b/>
+                <w:bCs/>
+                <w:lang w:val="en-US"/>
+              </w:rPr>
+              <w:t>Angular + Node.js/Express + PostgreSQL</w:t>
+            </w:r>
+          </w:p>
+        </w:tc>
+        <w:tc>
+          <w:tcPr>
+            <w:tcW w:w="0" w:type="auto"/>
+            <w:vAlign w:val="center"/>
+            <w:hideMark/>
+          </w:tcPr>
+          <w:p>
+            <w:pPr>
+              <w:jc w:val="center"/>
+              <w:rPr>
+                <w:rFonts w:ascii="Times New Roman" w:hAnsi="Times New Roman" w:cs="Times New Roman"/>
+                <w:b/>
+                <w:bCs/>
+              </w:rPr>
+            </w:pPr>
+            <w:proofErr w:type="spellStart"/>
+            <w:r>
+              <w:rPr>
+                <w:rFonts w:ascii="Times New Roman" w:hAnsi="Times New Roman" w:cs="Times New Roman"/>
+                <w:b/>
+                <w:bCs/>
+              </w:rPr>
+              <w:t>React</w:t>
+            </w:r>
+            <w:proofErr w:type="spellEnd"/>
+            <w:r>
+              <w:rPr>
+                <w:rFonts w:ascii="Times New Roman" w:hAnsi="Times New Roman" w:cs="Times New Roman"/>
+                <w:b/>
+                <w:bCs/>
+              </w:rPr>
+              <w:t xml:space="preserve"> + </w:t>
+            </w:r>
+            <w:proofErr w:type="spellStart"/>
+            <w:r>
+              <w:rPr>
+                <w:rFonts w:ascii="Times New Roman" w:hAnsi="Times New Roman" w:cs="Times New Roman"/>
+                <w:b/>
+                <w:bCs/>
+              </w:rPr>
+              <w:t>Firebase</w:t>
+            </w:r>
+            <w:proofErr w:type="spellEnd"/>
+          </w:p>
+        </w:tc>
+      </w:tr>
+      <w:tr>
+        <w:trPr>
+          <w:tblCellSpacing w:w="15" w:type="dxa"/>
+        </w:trPr>
+        <w:tc>
+          <w:tcPr>
+            <w:tcW w:w="0" w:type="auto"/>
+            <w:vAlign w:val="center"/>
+            <w:hideMark/>
+          </w:tcPr>
+          <w:p>
+            <w:pPr>
+              <w:rPr>
+                <w:rFonts w:ascii="Times New Roman" w:hAnsi="Times New Roman" w:cs="Times New Roman"/>
+                <w:sz w:val="24"/>
+                <w:szCs w:val="24"/>
+              </w:rPr>
+            </w:pPr>
+            <w:proofErr w:type="spellStart"/>
+            <w:r>
+              <w:rPr>
+                <w:rFonts w:ascii="Times New Roman" w:hAnsi="Times New Roman" w:cs="Times New Roman"/>
+                <w:sz w:val="24"/>
+                <w:szCs w:val="24"/>
+              </w:rPr>
+              <w:t>Development</w:t>
+            </w:r>
+            <w:proofErr w:type="spellEnd"/>
+            <w:r>
+              <w:rPr>
+                <w:rFonts w:ascii="Times New Roman" w:hAnsi="Times New Roman" w:cs="Times New Roman"/>
+                <w:sz w:val="24"/>
+                <w:szCs w:val="24"/>
+              </w:rPr>
+              <w:t xml:space="preserve"> </w:t>
+            </w:r>
+            <w:proofErr w:type="spellStart"/>
+            <w:r>
+              <w:rPr>
+                <w:rFonts w:ascii="Times New Roman" w:hAnsi="Times New Roman" w:cs="Times New Roman"/>
+                <w:sz w:val="24"/>
+                <w:szCs w:val="24"/>
+              </w:rPr>
+              <w:t>Complexity</w:t>
+            </w:r>
+            <w:proofErr w:type="spellEnd"/>
+          </w:p>
+        </w:tc>
+        <w:tc>
+          <w:tcPr>
+            <w:tcW w:w="0" w:type="auto"/>
+            <w:vAlign w:val="center"/>
+            <w:hideMark/>
+          </w:tcPr>
+          <w:p>
+            <w:pPr>
+              <w:rPr>
+                <w:rFonts w:ascii="Times New Roman" w:hAnsi="Times New Roman" w:cs="Times New Roman"/>
+                <w:lang w:val="en-US"/>
+              </w:rPr>
+            </w:pPr>
+            <w:r>
+              <w:rPr>
+                <w:rFonts w:ascii="Times New Roman" w:hAnsi="Times New Roman" w:cs="Times New Roman"/>
+                <w:lang w:val="en-US"/>
+              </w:rPr>
+              <w:t>Requires separate frontend, backend, and database development.</w:t>
+            </w:r>
+          </w:p>
+        </w:tc>
+        <w:tc>
+          <w:tcPr>
+            <w:tcW w:w="0" w:type="auto"/>
+            <w:vAlign w:val="center"/>
+            <w:hideMark/>
+          </w:tcPr>
+          <w:p>
+            <w:pPr>
+              <w:rPr>
+                <w:rFonts w:ascii="Times New Roman" w:hAnsi="Times New Roman" w:cs="Times New Roman"/>
+                <w:lang w:val="en-US"/>
+              </w:rPr>
+            </w:pPr>
+            <w:r>
+              <w:rPr>
+                <w:rFonts w:ascii="Times New Roman" w:hAnsi="Times New Roman" w:cs="Times New Roman"/>
+                <w:lang w:val="en-US"/>
+              </w:rPr>
+              <w:t>Simplifies initial development through managed Firebase services.</w:t>
+            </w:r>
+          </w:p>
+        </w:tc>
+      </w:tr>
+      <w:tr>
+        <w:trPr>
+          <w:tblCellSpacing w:w="15" w:type="dxa"/>
+        </w:trPr>
+        <w:tc>
+          <w:tcPr>
+            <w:tcW w:w="0" w:type="auto"/>
+            <w:vAlign w:val="center"/>
+            <w:hideMark/>
+          </w:tcPr>
+          <w:p>
+            <w:pPr>
+              <w:rPr>
+                <w:rFonts w:ascii="Times New Roman" w:hAnsi="Times New Roman" w:cs="Times New Roman"/>
+                <w:sz w:val="24"/>
+                <w:szCs w:val="24"/>
+              </w:rPr>
+            </w:pPr>
+            <w:proofErr w:type="spellStart"/>
+            <w:r>
+              <w:rPr>
+                <w:rFonts w:ascii="Times New Roman" w:hAnsi="Times New Roman" w:cs="Times New Roman"/>
+                <w:sz w:val="24"/>
+                <w:szCs w:val="24"/>
+              </w:rPr>
+              <w:t>Maintainability</w:t>
+            </w:r>
+            <w:proofErr w:type="spellEnd"/>
+          </w:p>
+        </w:tc>
+        <w:tc>
+          <w:tcPr>
+            <w:tcW w:w="0" w:type="auto"/>
+            <w:vAlign w:val="center"/>
+            <w:hideMark/>
+          </w:tcPr>
+          <w:p>
+            <w:pPr>
+              <w:rPr>
+                <w:rFonts w:ascii="Times New Roman" w:hAnsi="Times New Roman" w:cs="Times New Roman"/>
+                <w:lang w:val="en-US"/>
+              </w:rPr>
+            </w:pPr>
+            <w:r>
+              <w:rPr>
+                <w:rFonts w:ascii="Times New Roman" w:hAnsi="Times New Roman" w:cs="Times New Roman"/>
+                <w:lang w:val="en-US"/>
+              </w:rPr>
+              <w:t>Provides a structured architecture and clear separation of components.</w:t>
+            </w:r>
+          </w:p>
+        </w:tc>
+        <w:tc>
+          <w:tcPr>
+            <w:tcW w:w="0" w:type="auto"/>
+            <w:vAlign w:val="center"/>
+            <w:hideMark/>
+          </w:tcPr>
+          <w:p>
+            <w:pPr>
+              <w:rPr>
+                <w:rFonts w:ascii="Times New Roman" w:hAnsi="Times New Roman" w:cs="Times New Roman"/>
+                <w:lang w:val="en-US"/>
+              </w:rPr>
+            </w:pPr>
+            <w:r>
+              <w:rPr>
+                <w:rFonts w:ascii="Times New Roman" w:hAnsi="Times New Roman" w:cs="Times New Roman"/>
+                <w:lang w:val="en-US"/>
+              </w:rPr>
+              <w:t>Supports reusable components and managed services but requires careful organization.</w:t>
+            </w:r>
+          </w:p>
+        </w:tc>
+      </w:tr>
+      <w:tr>
+        <w:trPr>
+          <w:tblCellSpacing w:w="15" w:type="dxa"/>
+        </w:trPr>
+        <w:tc>
+          <w:tcPr>
+            <w:tcW w:w="0" w:type="auto"/>
+            <w:vAlign w:val="center"/>
+            <w:hideMark/>
+          </w:tcPr>
+          <w:p>
+            <w:pPr>
+              <w:rPr>
+                <w:rFonts w:ascii="Times New Roman" w:hAnsi="Times New Roman" w:cs="Times New Roman"/>
+                <w:sz w:val="24"/>
+                <w:szCs w:val="24"/>
+              </w:rPr>
+            </w:pPr>
+            <w:proofErr w:type="spellStart"/>
+            <w:r>
+              <w:rPr>
+                <w:rFonts w:ascii="Times New Roman" w:hAnsi="Times New Roman" w:cs="Times New Roman"/>
+                <w:sz w:val="24"/>
+                <w:szCs w:val="24"/>
+              </w:rPr>
+              <w:t>Performance</w:t>
+            </w:r>
+            <w:proofErr w:type="spellEnd"/>
+          </w:p>
+        </w:tc>
+        <w:tc>
+          <w:tcPr>
+            <w:tcW w:w="0" w:type="auto"/>
+            <w:vAlign w:val="center"/>
+            <w:hideMark/>
+          </w:tcPr>
+          <w:p>
+            <w:pPr>
+              <w:rPr>
+                <w:rFonts w:ascii="Times New Roman" w:hAnsi="Times New Roman" w:cs="Times New Roman"/>
+                <w:lang w:val="en-US"/>
+              </w:rPr>
+            </w:pPr>
+            <w:r>
+              <w:rPr>
+                <w:rFonts w:ascii="Times New Roman" w:hAnsi="Times New Roman" w:cs="Times New Roman"/>
+                <w:lang w:val="en-US"/>
+              </w:rPr>
+              <w:t>Supports REST APIs and relational database operations.</w:t>
+            </w:r>
+          </w:p>
+        </w:tc>
+        <w:tc>
+          <w:tcPr>
+            <w:tcW w:w="0" w:type="auto"/>
+            <w:vAlign w:val="center"/>
+            <w:hideMark/>
+          </w:tcPr>
+          <w:p>
+            <w:pPr>
+              <w:rPr>
+                <w:rFonts w:ascii="Times New Roman" w:hAnsi="Times New Roman" w:cs="Times New Roman"/>
+                <w:lang w:val="en-US"/>
+              </w:rPr>
+            </w:pPr>
+            <w:r>
+              <w:rPr>
+                <w:rFonts w:ascii="Times New Roman" w:hAnsi="Times New Roman" w:cs="Times New Roman"/>
+                <w:lang w:val="en-US"/>
+              </w:rPr>
+              <w:t>Supports real-time data synchronization and scalable cloud services.</w:t>
+            </w:r>
+          </w:p>
+        </w:tc>
+      </w:tr>
+      <w:tr>
+        <w:trPr>
+          <w:tblCellSpacing w:w="15" w:type="dxa"/>
+        </w:trPr>
+        <w:tc>
+          <w:tcPr>
+            <w:tcW w:w="0" w:type="auto"/>
+            <w:vAlign w:val="center"/>
+            <w:hideMark/>
+          </w:tcPr>
+          <w:p>
+            <w:pPr>
+              <w:rPr>
+                <w:rFonts w:ascii="Times New Roman" w:hAnsi="Times New Roman" w:cs="Times New Roman"/>
+                <w:sz w:val="24"/>
+                <w:szCs w:val="24"/>
+              </w:rPr>
+            </w:pPr>
+            <w:proofErr w:type="spellStart"/>
+            <w:r>
+              <w:rPr>
+                <w:rFonts w:ascii="Times New Roman" w:hAnsi="Times New Roman" w:cs="Times New Roman"/>
+                <w:sz w:val="24"/>
+                <w:szCs w:val="24"/>
+              </w:rPr>
+              <w:t>Accessibility</w:t>
+            </w:r>
+            <w:proofErr w:type="spellEnd"/>
+            <w:r>
+              <w:rPr>
+                <w:rFonts w:ascii="Times New Roman" w:hAnsi="Times New Roman" w:cs="Times New Roman"/>
+                <w:sz w:val="24"/>
+                <w:szCs w:val="24"/>
+              </w:rPr>
+              <w:t xml:space="preserve"> </w:t>
+            </w:r>
+            <w:proofErr w:type="spellStart"/>
+            <w:r>
+              <w:rPr>
+                <w:rFonts w:ascii="Times New Roman" w:hAnsi="Times New Roman" w:cs="Times New Roman"/>
+                <w:sz w:val="24"/>
+                <w:szCs w:val="24"/>
+              </w:rPr>
+              <w:t>Support</w:t>
+            </w:r>
+            <w:proofErr w:type="spellEnd"/>
+          </w:p>
+        </w:tc>
+        <w:tc>
+          <w:tcPr>
+            <w:tcW w:w="0" w:type="auto"/>
+            <w:vAlign w:val="center"/>
+            <w:hideMark/>
+          </w:tcPr>
+          <w:p>
+            <w:pPr>
+              <w:rPr>
+                <w:rFonts w:ascii="Times New Roman" w:hAnsi="Times New Roman" w:cs="Times New Roman"/>
+                <w:lang w:val="en-US"/>
+              </w:rPr>
+            </w:pPr>
+            <w:r>
+              <w:rPr>
+                <w:rFonts w:ascii="Times New Roman" w:hAnsi="Times New Roman" w:cs="Times New Roman"/>
+                <w:lang w:val="en-US"/>
+              </w:rPr>
+              <w:t>Angular provides accessibility tools such as Angular CDK.</w:t>
+            </w:r>
+          </w:p>
+        </w:tc>
+        <w:tc>
+          <w:tcPr>
+            <w:tcW w:w="0" w:type="auto"/>
+            <w:vAlign w:val="center"/>
+            <w:hideMark/>
+          </w:tcPr>
+          <w:p>
+            <w:pPr>
+              <w:rPr>
+                <w:rFonts w:ascii="Times New Roman" w:hAnsi="Times New Roman" w:cs="Times New Roman"/>
+                <w:lang w:val="en-US"/>
+              </w:rPr>
+            </w:pPr>
+            <w:r>
+              <w:rPr>
+                <w:rFonts w:ascii="Times New Roman" w:hAnsi="Times New Roman" w:cs="Times New Roman"/>
+                <w:lang w:val="en-US"/>
+              </w:rPr>
+              <w:t>React supports accessible interfaces through semantic HTML and accessibility libraries.</w:t>
+            </w:r>
+          </w:p>
+        </w:tc>
+      </w:tr>
+      <w:tr>
+        <w:trPr>
+          <w:tblCellSpacing w:w="15" w:type="dxa"/>
+        </w:trPr>
+        <w:tc>
+          <w:tcPr>
+            <w:tcW w:w="0" w:type="auto"/>
+            <w:vAlign w:val="center"/>
+            <w:hideMark/>
+          </w:tcPr>
+          <w:p>
+            <w:pPr>
+              <w:rPr>
+                <w:rFonts w:ascii="Times New Roman" w:hAnsi="Times New Roman" w:cs="Times New Roman"/>
+                <w:sz w:val="24"/>
+                <w:szCs w:val="24"/>
+              </w:rPr>
+            </w:pPr>
+            <w:proofErr w:type="spellStart"/>
+            <w:r>
+              <w:rPr>
+                <w:rFonts w:ascii="Times New Roman" w:hAnsi="Times New Roman" w:cs="Times New Roman"/>
+                <w:sz w:val="24"/>
+                <w:szCs w:val="24"/>
+              </w:rPr>
+              <w:t>Authentication</w:t>
+            </w:r>
+            <w:proofErr w:type="spellEnd"/>
+          </w:p>
+        </w:tc>
+        <w:tc>
+          <w:tcPr>
+            <w:tcW w:w="0" w:type="auto"/>
+            <w:vAlign w:val="center"/>
+            <w:hideMark/>
+          </w:tcPr>
+          <w:p>
+            <w:pPr>
+              <w:rPr>
+                <w:rFonts w:ascii="Times New Roman" w:hAnsi="Times New Roman" w:cs="Times New Roman"/>
+                <w:lang w:val="en-US"/>
+              </w:rPr>
+            </w:pPr>
+            <w:r>
+              <w:rPr>
+                <w:rFonts w:ascii="Times New Roman" w:hAnsi="Times New Roman" w:cs="Times New Roman"/>
+                <w:lang w:val="en-US"/>
+              </w:rPr>
+              <w:t>Requires implementing and maintaining authentication logic.</w:t>
+            </w:r>
+          </w:p>
+        </w:tc>
+        <w:tc>
+          <w:tcPr>
+            <w:tcW w:w="0" w:type="auto"/>
+            <w:vAlign w:val="center"/>
+            <w:hideMark/>
+          </w:tcPr>
+          <w:p>
+            <w:pPr>
+              <w:rPr>
+                <w:rFonts w:ascii="Times New Roman" w:hAnsi="Times New Roman" w:cs="Times New Roman"/>
+                <w:lang w:val="en-US"/>
+              </w:rPr>
+            </w:pPr>
+            <w:r>
+              <w:rPr>
+                <w:rFonts w:ascii="Times New Roman" w:hAnsi="Times New Roman" w:cs="Times New Roman"/>
+                <w:lang w:val="en-US"/>
+              </w:rPr>
+              <w:t>Firebase Authentication provides ready-to-use authentication services.</w:t>
+            </w:r>
+          </w:p>
+        </w:tc>
+      </w:tr>
+      <w:tr>
+        <w:trPr>
+          <w:tblCellSpacing w:w="15" w:type="dxa"/>
+        </w:trPr>
+        <w:tc>
+          <w:tcPr>
+            <w:tcW w:w="0" w:type="auto"/>
+            <w:vAlign w:val="center"/>
+            <w:hideMark/>
+          </w:tcPr>
+          <w:p>
+            <w:pPr>
+              <w:rPr>
+                <w:rFonts w:ascii="Times New Roman" w:hAnsi="Times New Roman" w:cs="Times New Roman"/>
+                <w:sz w:val="24"/>
+                <w:szCs w:val="24"/>
+              </w:rPr>
+            </w:pPr>
+            <w:proofErr w:type="spellStart"/>
+            <w:r>
+              <w:rPr>
+                <w:rFonts w:ascii="Times New Roman" w:hAnsi="Times New Roman" w:cs="Times New Roman"/>
+                <w:sz w:val="24"/>
+                <w:szCs w:val="24"/>
+              </w:rPr>
+              <w:t>Database</w:t>
+            </w:r>
+            <w:proofErr w:type="spellEnd"/>
+          </w:p>
+        </w:tc>
+        <w:tc>
+          <w:tcPr>
+            <w:tcW w:w="0" w:type="auto"/>
+            <w:vAlign w:val="center"/>
+            <w:hideMark/>
+          </w:tcPr>
+          <w:p>
+            <w:pPr>
+              <w:rPr>
+                <w:rFonts w:ascii="Times New Roman" w:hAnsi="Times New Roman" w:cs="Times New Roman"/>
+                <w:lang w:val="en-US"/>
+              </w:rPr>
+            </w:pPr>
+            <w:r>
+              <w:rPr>
+                <w:rFonts w:ascii="Times New Roman" w:hAnsi="Times New Roman" w:cs="Times New Roman"/>
+                <w:lang w:val="en-US"/>
+              </w:rPr>
+              <w:t>PostgreSQL supports relational data and complex queries.</w:t>
+            </w:r>
+          </w:p>
+        </w:tc>
+        <w:tc>
+          <w:tcPr>
+            <w:tcW w:w="0" w:type="auto"/>
+            <w:vAlign w:val="center"/>
+            <w:hideMark/>
+          </w:tcPr>
+          <w:p>
+            <w:pPr>
+              <w:rPr>
+                <w:rFonts w:ascii="Times New Roman" w:hAnsi="Times New Roman" w:cs="Times New Roman"/>
+                <w:lang w:val="en-US"/>
+              </w:rPr>
+            </w:pPr>
+            <w:r>
+              <w:rPr>
+                <w:rFonts w:ascii="Times New Roman" w:hAnsi="Times New Roman" w:cs="Times New Roman"/>
+                <w:lang w:val="en-US"/>
+              </w:rPr>
+              <w:t xml:space="preserve">Cloud </w:t>
+            </w:r>
+            <w:proofErr w:type="spellStart"/>
+            <w:r>
+              <w:rPr>
+                <w:rFonts w:ascii="Times New Roman" w:hAnsi="Times New Roman" w:cs="Times New Roman"/>
+                <w:lang w:val="en-US"/>
+              </w:rPr>
+              <w:t>Firestore</w:t>
+            </w:r>
+            <w:proofErr w:type="spellEnd"/>
+            <w:r>
+              <w:rPr>
+                <w:rFonts w:ascii="Times New Roman" w:hAnsi="Times New Roman" w:cs="Times New Roman"/>
+                <w:lang w:val="en-US"/>
+              </w:rPr>
+              <w:t xml:space="preserve"> provides document-based storage.</w:t>
+            </w:r>
+          </w:p>
+        </w:tc>
+      </w:tr>
+      <w:tr>
+        <w:trPr>
+          <w:tblCellSpacing w:w="15" w:type="dxa"/>
+        </w:trPr>
+        <w:tc>
+          <w:tcPr>
+            <w:tcW w:w="0" w:type="auto"/>
+            <w:vAlign w:val="center"/>
+            <w:hideMark/>
+          </w:tcPr>
+          <w:p>
+            <w:pPr>
+              <w:rPr>
+                <w:rFonts w:ascii="Times New Roman" w:hAnsi="Times New Roman" w:cs="Times New Roman"/>
+                <w:sz w:val="24"/>
+                <w:szCs w:val="24"/>
+              </w:rPr>
+            </w:pPr>
+            <w:proofErr w:type="spellStart"/>
+            <w:r>
+              <w:rPr>
+                <w:rFonts w:ascii="Times New Roman" w:hAnsi="Times New Roman" w:cs="Times New Roman"/>
+                <w:sz w:val="24"/>
+                <w:szCs w:val="24"/>
+              </w:rPr>
+              <w:t>Project</w:t>
+            </w:r>
+            <w:proofErr w:type="spellEnd"/>
+            <w:r>
+              <w:rPr>
+                <w:rFonts w:ascii="Times New Roman" w:hAnsi="Times New Roman" w:cs="Times New Roman"/>
+                <w:sz w:val="24"/>
+                <w:szCs w:val="24"/>
+              </w:rPr>
+              <w:t xml:space="preserve"> </w:t>
+            </w:r>
+            <w:proofErr w:type="spellStart"/>
+            <w:r>
+              <w:rPr>
+                <w:rFonts w:ascii="Times New Roman" w:hAnsi="Times New Roman" w:cs="Times New Roman"/>
+                <w:sz w:val="24"/>
+                <w:szCs w:val="24"/>
+              </w:rPr>
+              <w:t>Suitability</w:t>
+            </w:r>
+            <w:proofErr w:type="spellEnd"/>
+          </w:p>
+        </w:tc>
+        <w:tc>
+          <w:tcPr>
+            <w:tcW w:w="0" w:type="auto"/>
+            <w:vAlign w:val="center"/>
+            <w:hideMark/>
+          </w:tcPr>
+          <w:p>
+            <w:pPr>
+              <w:rPr>
+                <w:rFonts w:ascii="Times New Roman" w:hAnsi="Times New Roman" w:cs="Times New Roman"/>
+                <w:lang w:val="en-US"/>
+              </w:rPr>
+            </w:pPr>
+            <w:r>
+              <w:rPr>
+                <w:rFonts w:ascii="Times New Roman" w:hAnsi="Times New Roman" w:cs="Times New Roman"/>
+                <w:lang w:val="en-US"/>
+              </w:rPr>
+              <w:t>Suitable for structured learning content, assessments, and progress tracking.</w:t>
+            </w:r>
+          </w:p>
+        </w:tc>
+        <w:tc>
+          <w:tcPr>
+            <w:tcW w:w="0" w:type="auto"/>
+            <w:vAlign w:val="center"/>
+            <w:hideMark/>
+          </w:tcPr>
+          <w:p>
+            <w:pPr>
+              <w:rPr>
+                <w:rFonts w:ascii="Times New Roman" w:hAnsi="Times New Roman" w:cs="Times New Roman"/>
+                <w:lang w:val="en-US"/>
+              </w:rPr>
+            </w:pPr>
+            <w:r>
+              <w:rPr>
+                <w:rFonts w:ascii="Times New Roman" w:hAnsi="Times New Roman" w:cs="Times New Roman"/>
+                <w:lang w:val="en-US"/>
+              </w:rPr>
+              <w:t>Suitable for rapid development of learning applications and prototypes.</w:t>
+            </w:r>
+          </w:p>
+        </w:tc>
+      </w:tr>
+      <w:tr>
+        <w:trPr>
+          <w:tblCellSpacing w:w="15" w:type="dxa"/>
+        </w:trPr>
+        <w:tc>
+          <w:tcPr>
+            <w:tcW w:w="0" w:type="auto"/>
+            <w:vAlign w:val="center"/>
+            <w:hideMark/>
+          </w:tcPr>
+          <w:p>
+            <w:pPr>
+              <w:rPr>
+                <w:rFonts w:ascii="Times New Roman" w:hAnsi="Times New Roman" w:cs="Times New Roman"/>
+                <w:sz w:val="24"/>
+                <w:szCs w:val="24"/>
+              </w:rPr>
+            </w:pPr>
+            <w:proofErr w:type="spellStart"/>
+            <w:r>
+              <w:rPr>
+                <w:rFonts w:ascii="Times New Roman" w:hAnsi="Times New Roman" w:cs="Times New Roman"/>
+                <w:sz w:val="24"/>
+                <w:szCs w:val="24"/>
+              </w:rPr>
+              <w:t>Team</w:t>
+            </w:r>
+            <w:proofErr w:type="spellEnd"/>
+            <w:r>
+              <w:rPr>
+                <w:rFonts w:ascii="Times New Roman" w:hAnsi="Times New Roman" w:cs="Times New Roman"/>
+                <w:sz w:val="24"/>
+                <w:szCs w:val="24"/>
+              </w:rPr>
+              <w:t xml:space="preserve"> </w:t>
+            </w:r>
+            <w:proofErr w:type="spellStart"/>
+            <w:r>
+              <w:rPr>
+                <w:rFonts w:ascii="Times New Roman" w:hAnsi="Times New Roman" w:cs="Times New Roman"/>
+                <w:sz w:val="24"/>
+                <w:szCs w:val="24"/>
+              </w:rPr>
+              <w:t>Experience</w:t>
+            </w:r>
+            <w:proofErr w:type="spellEnd"/>
+          </w:p>
+        </w:tc>
+        <w:tc>
+          <w:tcPr>
+            <w:tcW w:w="0" w:type="auto"/>
+            <w:vAlign w:val="center"/>
+            <w:hideMark/>
+          </w:tcPr>
+          <w:p>
+            <w:pPr>
+              <w:rPr>
+                <w:rFonts w:ascii="Times New Roman" w:hAnsi="Times New Roman" w:cs="Times New Roman"/>
+                <w:lang w:val="en-US"/>
+              </w:rPr>
+            </w:pPr>
+            <w:r>
+              <w:rPr>
+                <w:rFonts w:ascii="Times New Roman" w:hAnsi="Times New Roman" w:cs="Times New Roman"/>
+                <w:lang w:val="en-US"/>
+              </w:rPr>
+              <w:t>The team has experience with Angular, Node.js, and PostgreSQL.</w:t>
+            </w:r>
+          </w:p>
+        </w:tc>
+        <w:tc>
+          <w:tcPr>
+            <w:tcW w:w="0" w:type="auto"/>
+            <w:vAlign w:val="center"/>
+            <w:hideMark/>
+          </w:tcPr>
+          <w:p>
+            <w:pPr>
+              <w:rPr>
+                <w:rFonts w:ascii="Times New Roman" w:hAnsi="Times New Roman" w:cs="Times New Roman"/>
+                <w:lang w:val="en-US"/>
+              </w:rPr>
+            </w:pPr>
+            <w:r>
+              <w:rPr>
+                <w:rFonts w:ascii="Times New Roman" w:hAnsi="Times New Roman" w:cs="Times New Roman"/>
+                <w:lang w:val="en-US"/>
+              </w:rPr>
+              <w:t>The team would need additional time to learn Firebase.</w:t>
+            </w:r>
+          </w:p>
+        </w:tc>
+      </w:tr>
+    </w:tbl>
+    <w:p>
+      <w:pPr>
+        <w:pStyle w:val="3"/>
+        <w:rPr>
+          <w:rFonts w:ascii="Times New Roman" w:hAnsi="Times New Roman" w:cs="Times New Roman"/>
+          <w:color w:val="auto"/>
+          <w:lang w:val="en-US"/>
+        </w:rPr>
+      </w:pPr>
+      <w:r>
+        <w:rPr>
+          <w:rFonts w:ascii="Times New Roman" w:hAnsi="Times New Roman" w:cs="Times New Roman"/>
+          <w:color w:val="auto"/>
+          <w:lang w:val="en-US"/>
+        </w:rPr>
+        <w:t>6.2. Advantages and Limitations of React + Firebase</w:t>
+      </w:r>
+    </w:p>
+    <w:p>
+      <w:pPr>
+        <w:pStyle w:val="a3"/>
+        <w:rPr>
+          <w:lang w:val="en-US"/>
+        </w:rPr>
+      </w:pPr>
+      <w:r>
+        <w:rPr>
+          <w:lang w:val="en-US"/>
+        </w:rPr>
+        <w:t>React with Firebase has several advantages for this project.</w:t>
+      </w:r>
+    </w:p>
+    <w:p>
+      <w:pPr>
+        <w:pStyle w:val="a3"/>
+        <w:rPr>
+          <w:lang w:val="en-US"/>
+        </w:rPr>
+      </w:pPr>
+      <w:r>
+        <w:rPr>
+          <w:lang w:val="en-US"/>
+        </w:rPr>
+        <w:t xml:space="preserve">Firebase Authentication can simplify user registration and login. Cloud </w:t>
+      </w:r>
+      <w:proofErr w:type="spellStart"/>
+      <w:r>
+        <w:rPr>
+          <w:lang w:val="en-US"/>
+        </w:rPr>
+        <w:t>Firestore</w:t>
+      </w:r>
+      <w:proofErr w:type="spellEnd"/>
+      <w:r>
+        <w:rPr>
+          <w:lang w:val="en-US"/>
+        </w:rPr>
+        <w:t xml:space="preserve"> can store user profiles, assessment results, and learning progress. Firebase Hosting can also make application deployment easier.</w:t>
+      </w:r>
+    </w:p>
+    <w:p>
+      <w:pPr>
+        <w:pStyle w:val="a3"/>
+        <w:rPr>
+          <w:lang w:val="en-US"/>
+        </w:rPr>
+      </w:pPr>
+      <w:r>
+        <w:rPr>
+          <w:lang w:val="en-US"/>
+        </w:rPr>
+        <w:t>These features could help the team develop a working prototype faster.</w:t>
+      </w:r>
+    </w:p>
+    <w:p>
+      <w:pPr>
+        <w:pStyle w:val="a3"/>
+        <w:rPr>
+          <w:lang w:val="en-US"/>
+        </w:rPr>
+      </w:pPr>
+      <w:r>
+        <w:rPr>
+          <w:lang w:val="en-US"/>
+        </w:rPr>
+        <w:t xml:space="preserve">However, Firebase also has some limitations. </w:t>
+      </w:r>
+      <w:proofErr w:type="spellStart"/>
+      <w:r>
+        <w:rPr>
+          <w:lang w:val="en-US"/>
+        </w:rPr>
+        <w:t>Firestore</w:t>
+      </w:r>
+      <w:proofErr w:type="spellEnd"/>
+      <w:r>
+        <w:rPr>
+          <w:lang w:val="en-US"/>
+        </w:rPr>
+        <w:t xml:space="preserve"> uses a document-based data model, which may require additional planning for relationships between users, lessons, assessments, and progress records.</w:t>
+      </w:r>
+    </w:p>
+    <w:p>
+      <w:pPr>
+        <w:pStyle w:val="a3"/>
+        <w:rPr>
+          <w:lang w:val="en-US"/>
+        </w:rPr>
+      </w:pPr>
+      <w:r>
+        <w:rPr>
+          <w:lang w:val="en-US"/>
+        </w:rPr>
+        <w:t>The application would also depend more on Firebase services, and costs could increase with higher usage.</w:t>
+      </w:r>
+    </w:p>
+    <w:p>
+      <w:pPr>
+        <w:pStyle w:val="3"/>
+        <w:rPr>
+          <w:rFonts w:ascii="Times New Roman" w:hAnsi="Times New Roman" w:cs="Times New Roman"/>
+          <w:b/>
+          <w:bCs/>
+          <w:color w:val="auto"/>
+          <w:lang w:val="en-US"/>
+        </w:rPr>
+      </w:pPr>
+      <w:r>
+        <w:rPr>
+          <w:rFonts w:ascii="Times New Roman" w:hAnsi="Times New Roman" w:cs="Times New Roman"/>
+          <w:b/>
+          <w:bCs/>
+          <w:color w:val="auto"/>
+          <w:lang w:val="en-US"/>
+        </w:rPr>
+        <w:t>6.3. Final Technology Decision</w:t>
+      </w:r>
+    </w:p>
+    <w:p>
+      <w:pPr>
+        <w:pStyle w:val="a3"/>
+        <w:rPr>
+          <w:lang w:val="en-US"/>
+        </w:rPr>
+      </w:pPr>
+      <w:r>
+        <w:rPr>
+          <w:lang w:val="en-US"/>
+        </w:rPr>
+        <w:t>After comparing both technology stacks, Angular with TypeScript, Node.js with Express, and PostgreSQL remain the preferred choice for the project.</w:t>
+      </w:r>
+    </w:p>
+    <w:p>
+      <w:pPr>
+        <w:pStyle w:val="a3"/>
+        <w:rPr>
+          <w:lang w:val="en-US"/>
+        </w:rPr>
+      </w:pPr>
+      <w:r>
+        <w:rPr>
+          <w:lang w:val="en-US"/>
+        </w:rPr>
+        <w:t>Angular provides a structured architecture for learning modules and accessible user interfaces. Node.js with Express allows the team to implement custom application logic and REST APIs. PostgreSQL supports relational data storage and helps maintain data consistency.</w:t>
+      </w:r>
+    </w:p>
+    <w:p>
+      <w:pPr>
+        <w:pStyle w:val="a3"/>
+        <w:rPr>
+          <w:lang w:val="en-US"/>
+        </w:rPr>
+      </w:pPr>
+      <w:r>
+        <w:rPr>
+          <w:lang w:val="en-US"/>
+        </w:rPr>
+        <w:t>The team's existing experience with these technologies is another important reason for keeping the original stack.</w:t>
+      </w:r>
+    </w:p>
+    <w:p>
+      <w:pPr>
+        <w:pStyle w:val="a3"/>
+        <w:rPr>
+          <w:lang w:val="en-US"/>
+        </w:rPr>
+      </w:pPr>
+      <w:r>
+        <w:rPr>
+          <w:lang w:val="en-US"/>
+        </w:rPr>
+        <w:t>React with Firebase is a suitable alternative, especially for rapid prototype development. However, the original stack provides more direct control over the backend and database structure.</w:t>
+      </w:r>
+    </w:p>
+    <w:p>
+      <w:pPr>
+        <w:pStyle w:val="a3"/>
+        <w:rPr>
+          <w:lang w:val="en-US"/>
+        </w:rPr>
+      </w:pPr>
+      <w:r>
+        <w:rPr>
+          <w:lang w:val="en-US"/>
+        </w:rPr>
+        <w:t>Therefore, the te</w:t>
       </w:r>
       <w:bookmarkStart w:id="0" w:name="_GoBack"/>
       <w:bookmarkEnd w:id="0"/>
+      <w:r>
+        <w:rPr>
+          <w:lang w:val="en-US"/>
+        </w:rPr>
+        <w:t>am prefers to continue with Angular, Node.js with Express, and PostgreSQL.</w:t>
+      </w:r>
     </w:p>
     <w:p>
       <w:pPr>
@@ -3900,7 +5027,7 @@
           <w:szCs w:val="24"/>
           <w:lang w:val="en-US"/>
         </w:rPr>
-        <w:t>6. Conclusion</w:t>
+        <w:t>7. Conclusion</w:t>
       </w:r>
     </w:p>
     <w:p>
@@ -3914,7 +5041,7 @@
         <w:rPr>
           <w:lang w:val="en-US"/>
         </w:rPr>
-        <w:t>This document compared three frontend frameworks, three backend technologies, and three database management systems using five evaluation criteria.</w:t>
+        <w:t>This document compared three frontend technologies, three backend technologies, and three database management systems using five evaluation criteria.</w:t>
       </w:r>
     </w:p>
     <w:p>
@@ -3928,7 +5055,7 @@
         <w:rPr>
           <w:lang w:val="en-US"/>
         </w:rPr>
-        <w:t>Angular, Node.js with Express, and PostgreSQL were selected as the most suitable technologies for the project.</w:t>
+        <w:t>Angular with TypeScript, Node.js with Express, and PostgreSQL were selected as the preferred technologies for the project.</w:t>
       </w:r>
     </w:p>
     <w:p>
@@ -3942,7 +5069,7 @@
         <w:rPr>
           <w:lang w:val="en-US"/>
         </w:rPr>
-        <w:t>Angular provides a structured frontend architecture and accessibility development tools. Node.js with Express supports REST API development and application logic. PostgreSQL provides reliable storage for structured and related data.</w:t>
+        <w:t>Based on the supervisor's feedback, React with Firebase was also considered as an alternative technology stack.</w:t>
       </w:r>
     </w:p>
     <w:p>
@@ -3956,7 +5083,35 @@
         <w:rPr>
           <w:lang w:val="en-US"/>
         </w:rPr>
-        <w:t>Together, these technologies can support the development of a maintainable and accessible web application that helps older adults improve their digital skills.</w:t>
+        <w:t>The comparison showed that React with Firebase could simplify authentication, database management, and deployment. However, the original stack provides a structured architecture, flexible backend development, and reliable relational data storage.</w:t>
+      </w:r>
+    </w:p>
+    <w:p>
+      <w:pPr>
+        <w:pStyle w:val="a3"/>
+        <w:rPr>
+          <w:lang w:val="en-US"/>
+        </w:rPr>
+      </w:pPr>
+      <w:r>
+        <w:rPr>
+          <w:lang w:val="en-US"/>
+        </w:rPr>
+        <w:t>The selected technologies also match the team's existing experience and the requirements of the web application for older adults.</w:t>
+      </w:r>
+    </w:p>
+    <w:p>
+      <w:pPr>
+        <w:pStyle w:val="a3"/>
+        <w:rPr>
+          <w:lang w:val="en-US"/>
+        </w:rPr>
+      </w:pPr>
+      <w:r>
+        <w:rPr>
+          <w:lang w:val="en-US"/>
+        </w:rPr>
+        <w:t>Therefore, Angular, Node.js with Express, and PostgreSQL remain the preferred technologies for developing the application.</w:t>
       </w:r>
     </w:p>
     <w:p>

</xml_diff>